<commit_message>
Revise final project proposal form
Update the final project proposal into a more structured final project proposal form with clearer section headings, expanded guidance on collections and descriptive information, and a revised rights/copyright checklist. The corresponding DOCX and PDF versions were regenerated to match the markdown form.
</commit_message>
<xml_diff>
--- a/resources/final_project_proposal_form.docx
+++ b/resources/final_project_proposal_form.docx
@@ -1,6 +1,6 @@
 
 <file path=word/document.xml><?xml version="1.0" encoding="utf-8"?>
-<w:document xmlns:wpc="http://schemas.microsoft.com/office/word/2010/wordprocessingCanvas" xmlns:cx="http://schemas.microsoft.com/office/drawing/2014/chartex" xmlns:cx1="http://schemas.microsoft.com/office/drawing/2015/9/8/chartex" xmlns:cx2="http://schemas.microsoft.com/office/drawing/2015/10/21/chartex" xmlns:cx3="http://schemas.microsoft.com/office/drawing/2016/5/9/chartex" xmlns:cx4="http://schemas.microsoft.com/office/drawing/2016/5/10/chartex" xmlns:cx5="http://schemas.microsoft.com/office/drawing/2016/5/11/chartex" xmlns:cx6="http://schemas.microsoft.com/office/drawing/2016/5/12/chartex" xmlns:cx7="http://schemas.microsoft.com/office/drawing/2016/5/13/chartex" xmlns:cx8="http://schemas.microsoft.com/office/drawing/2016/5/14/chartex" xmlns:mc="http://schemas.openxmlformats.org/markup-compatibility/2006" xmlns:aink="http://schemas.microsoft.com/office/drawing/2016/ink" xmlns:am3d="http://schemas.microsoft.com/office/drawing/2017/model3d" xmlns:o="urn:schemas-microsoft-com:office:office" xmlns:oel="http://schemas.microsoft.com/office/2019/extlst" xmlns:r="http://schemas.openxmlformats.org/officeDocument/2006/relationships" xmlns:m="http://schemas.openxmlformats.org/officeDocument/2006/math" xmlns:v="urn:schemas-microsoft-com:vml" xmlns:wp14="http://schemas.microsoft.com/office/word/2010/wordprocessingDrawing" xmlns:wp="http://schemas.openxmlformats.org/drawingml/2006/wordprocessingDrawing" xmlns:w10="urn:schemas-microsoft-com:office:word" xmlns:w="http://schemas.openxmlformats.org/wordprocessingml/2006/main" xmlns:w14="http://schemas.microsoft.com/office/word/2010/wordml" xmlns:w15="http://schemas.microsoft.com/office/word/2012/wordml" xmlns:w16cex="http://schemas.microsoft.com/office/word/2018/wordml/cex" xmlns:w16cid="http://schemas.microsoft.com/office/word/2016/wordml/cid" xmlns:w16="http://schemas.microsoft.com/office/word/2018/wordml" xmlns:w16sdtdh="http://schemas.microsoft.com/office/word/2020/wordml/sdtdatahash" xmlns:w16se="http://schemas.microsoft.com/office/word/2015/wordml/symex" xmlns:wpg="http://schemas.microsoft.com/office/word/2010/wordprocessingGroup" xmlns:wpi="http://schemas.microsoft.com/office/word/2010/wordprocessingInk" xmlns:wne="http://schemas.microsoft.com/office/word/2006/wordml" xmlns:wps="http://schemas.microsoft.com/office/word/2010/wordprocessingShape" mc:Ignorable="w14 w15 w16se w16cid w16 w16cex w16sdtdh wp14">
+<w:document xmlns:wpc="http://schemas.microsoft.com/office/word/2010/wordprocessingCanvas" xmlns:cx="http://schemas.microsoft.com/office/drawing/2014/chartex" xmlns:cx1="http://schemas.microsoft.com/office/drawing/2015/9/8/chartex" xmlns:cx2="http://schemas.microsoft.com/office/drawing/2015/10/21/chartex" xmlns:cx3="http://schemas.microsoft.com/office/drawing/2016/5/9/chartex" xmlns:cx4="http://schemas.microsoft.com/office/drawing/2016/5/10/chartex" xmlns:cx5="http://schemas.microsoft.com/office/drawing/2016/5/11/chartex" xmlns:cx6="http://schemas.microsoft.com/office/drawing/2016/5/12/chartex" xmlns:cx7="http://schemas.microsoft.com/office/drawing/2016/5/13/chartex" xmlns:cx8="http://schemas.microsoft.com/office/drawing/2016/5/14/chartex" xmlns:mc="http://schemas.openxmlformats.org/markup-compatibility/2006" xmlns:m="http://schemas.openxmlformats.org/officeDocument/2006/math" xmlns:aink="http://schemas.microsoft.com/office/drawing/2016/ink" xmlns:am3d="http://schemas.microsoft.com/office/drawing/2017/model3d" xmlns:oel="http://schemas.microsoft.com/office/2019/extlst" xmlns:r="http://schemas.openxmlformats.org/officeDocument/2006/relationships" xmlns:wp14="http://schemas.microsoft.com/office/word/2010/wordprocessingDrawing" xmlns:wp="http://schemas.openxmlformats.org/drawingml/2006/wordprocessingDrawing" xmlns:wpg="http://schemas.microsoft.com/office/word/2010/wordprocessingGroup" xmlns:wpi="http://schemas.microsoft.com/office/word/2010/wordprocessingInk" xmlns:wps="http://schemas.microsoft.com/office/word/2010/wordprocessingShape" xmlns:o="urn:schemas-microsoft-com:office:office" xmlns:v="urn:schemas-microsoft-com:vml" xmlns:w10="urn:schemas-microsoft-com:office:word" xmlns:w="http://schemas.openxmlformats.org/wordprocessingml/2006/main" xmlns:w14="http://schemas.microsoft.com/office/word/2010/wordml" xmlns:w15="http://schemas.microsoft.com/office/word/2012/wordml" xmlns:w16cex="http://schemas.microsoft.com/office/word/2018/wordml/cex" xmlns:w16cid="http://schemas.microsoft.com/office/word/2016/wordml/cid" xmlns:w16="http://schemas.microsoft.com/office/word/2018/wordml" xmlns:w16sdtdh="http://schemas.microsoft.com/office/word/2020/wordml/sdtdatahash" xmlns:w16sdtfl="http://schemas.microsoft.com/office/word/2024/wordml/sdtformatlock" xmlns:w16se="http://schemas.microsoft.com/office/word/2015/wordml/symex" xmlns:w16du="http://schemas.microsoft.com/office/word/2023/wordml/word16du" xmlns:wne="http://schemas.microsoft.com/office/word/2006/wordml" mc:Ignorable="w14 w15 w16se w16cid w16 w16cex w16sdtdh w16sdtfl w16du wp14">
   <w:body>
     <w:p>
       <w:pPr>
@@ -10,11 +10,14 @@
       <w:r>
         <w:t>Z652 Digital Libraries</w:t>
       </w:r>
-      <w:r>
-        <w:br/>
-      </w:r>
-      <w:r>
-        <w:t>Project Proposal Form</w:t>
+    </w:p>
+    <w:p>
+      <w:pPr>
+        <w:pStyle w:val="Heading2"/>
+        <w:keepNext/>
+      </w:pPr>
+      <w:r>
+        <w:t>Final Project Proposal</w:t>
       </w:r>
     </w:p>
     <w:p>
@@ -22,21 +25,127 @@
         <w:rPr>
           <w:b/>
         </w:rPr>
-        <w:t>Y</w:t>
-      </w:r>
-      <w:r>
-        <w:rPr>
-          <w:b/>
-        </w:rPr>
-        <w:t>our Name:</w:t>
-      </w:r>
-    </w:p>
-    <w:p>
+        <w:t>Your Name:</w:t>
+      </w:r>
+      <w:r>
+        <w:br/>
+      </w:r>
       <w:r>
         <w:rPr>
           <w:b/>
         </w:rPr>
         <w:t>Project Name:</w:t>
+      </w:r>
+    </w:p>
+    <w:p>
+      <w:pPr>
+        <w:pStyle w:val="Heading3"/>
+        <w:keepNext/>
+      </w:pPr>
+      <w:r>
+        <w:t>1. Project Description</w:t>
+      </w:r>
+    </w:p>
+    <w:p>
+      <w:r>
+        <w:t>Briefly describe the digital collection you propose to create. What materials will it contain, and what will the completed project make possible for users?</w:t>
+      </w:r>
+    </w:p>
+    <w:p>
+      <w:pPr>
+        <w:pStyle w:val="Heading3"/>
+        <w:keepNext/>
+      </w:pPr>
+      <w:r>
+        <w:t>2. Significance</w:t>
+      </w:r>
+    </w:p>
+    <w:p>
+      <w:r>
+        <w:t>Why is this collection worth creating? Briefly identify any existing digital collections or resources that are similar, related, or complementary. Include links when appropriate.</w:t>
+      </w:r>
+    </w:p>
+    <w:p>
+      <w:pPr>
+        <w:pStyle w:val="Heading3"/>
+        <w:keepNext/>
+      </w:pPr>
+      <w:r>
+        <w:t>3. Audience</w:t>
+      </w:r>
+    </w:p>
+    <w:p>
+      <w:r>
+        <w:t>Who are the intended users of the collection? What might they want to find, learn, or do with it?</w:t>
+      </w:r>
+    </w:p>
+    <w:p>
+      <w:pPr>
+        <w:pStyle w:val="Heading3"/>
+        <w:keepNext/>
+      </w:pPr>
+      <w:r>
+        <w:t>4. Collection and Access</w:t>
+      </w:r>
+    </w:p>
+    <w:p>
+      <w:r>
+        <w:t>Describe the materials you expect to include, including types and approximate quantities (for example, 12 letters comprising 31 pages; 14 photographs; 6 posters).</w:t>
+      </w:r>
+    </w:p>
+    <w:p>
+      <w:r>
+        <w:t>Where are the materials currently located, and how will you obtain or create the digital files?</w:t>
+      </w:r>
+    </w:p>
+    <w:p>
+      <w:r>
+        <w:t>If the materials belong to or are held by another person or institution, describe any arrangements needed for access or digitization.</w:t>
+      </w:r>
+    </w:p>
+    <w:p>
+      <w:pPr>
+        <w:pStyle w:val="Heading3"/>
+        <w:keepNext/>
+      </w:pPr>
+      <w:r>
+        <w:lastRenderedPageBreak/>
+        <w:t>5. Existing Descriptive Information</w:t>
+      </w:r>
+    </w:p>
+    <w:p>
+      <w:r>
+        <w:t>What descriptive information already exists for the materials? For example, you might already have titles, creators, dates, subjects, identifiers, descriptions, or other information about the items.</w:t>
+      </w:r>
+    </w:p>
+    <w:p>
+      <w:r>
+        <w:t>Where does this information currently exist (for example, on the objects themselves, in a finding aid, spreadsheet, database, website, or other source)?</w:t>
+      </w:r>
+    </w:p>
+    <w:p>
+      <w:r>
+        <w:rPr>
+          <w:b/>
+        </w:rPr>
+        <w:t>You do not need to design the metadata for your collection yet.</w:t>
+      </w:r>
+      <w:r>
+        <w:t xml:space="preserve"> We will develop your metadata approach during the metadata portion of the course.</w:t>
+      </w:r>
+    </w:p>
+    <w:p>
+      <w:pPr>
+        <w:pStyle w:val="Heading3"/>
+        <w:keepNext/>
+      </w:pPr>
+      <w:r>
+        <w:t>6. Rights and Copyright</w:t>
+      </w:r>
+    </w:p>
+    <w:p>
+      <w:r>
+        <w:t>Based on our work on copyright and rights, what is your current understanding of the copyright status of the materials? Check all that apply.</w:t>
       </w:r>
     </w:p>
     <w:p>
@@ -48,7 +157,34 @@
         <w:spacing w:before="0" w:after="0"/>
       </w:pPr>
       <w:r>
-        <w:t>Describe your project.</w:t>
+        <w:fldChar w:fldCharType="begin">
+          <w:ffData>
+            <w:name w:val="Check1"/>
+            <w:enabled/>
+            <w:calcOnExit w:val="0"/>
+            <w:checkBox>
+              <w:sizeAuto/>
+              <w:default w:val="0"/>
+            </w:checkBox>
+          </w:ffData>
+        </w:fldChar>
+      </w:r>
+      <w:bookmarkStart w:id="0" w:name="Check1"/>
+      <w:r>
+        <w:instrText xml:space="preserve"> FORMCHECKBOX </w:instrText>
+      </w:r>
+      <w:r>
+        <w:fldChar w:fldCharType="separate"/>
+      </w:r>
+      <w:r>
+        <w:fldChar w:fldCharType="end"/>
+      </w:r>
+      <w:bookmarkEnd w:id="0"/>
+      <w:r>
+        <w:t xml:space="preserve"> </w:t>
+      </w:r>
+      <w:r>
+        <w:t>Public domain</w:t>
       </w:r>
     </w:p>
     <w:p>
@@ -60,7 +196,32 @@
         <w:spacing w:before="0" w:after="0"/>
       </w:pPr>
       <w:r>
-        <w:t>Describe the significance of this project. Will this project complement or enhance other existing resources? Include links to related and complementary resources.</w:t>
+        <w:fldChar w:fldCharType="begin">
+          <w:ffData>
+            <w:name w:val="Check1"/>
+            <w:enabled/>
+            <w:calcOnExit w:val="0"/>
+            <w:checkBox>
+              <w:sizeAuto/>
+              <w:default w:val="0"/>
+            </w:checkBox>
+          </w:ffData>
+        </w:fldChar>
+      </w:r>
+      <w:r>
+        <w:instrText xml:space="preserve"> FORMCHECKBOX </w:instrText>
+      </w:r>
+      <w:r>
+        <w:fldChar w:fldCharType="separate"/>
+      </w:r>
+      <w:r>
+        <w:fldChar w:fldCharType="end"/>
+      </w:r>
+      <w:r>
+        <w:t xml:space="preserve"> </w:t>
+      </w:r>
+      <w:r>
+        <w:t>Copyright owned or controlled by me</w:t>
       </w:r>
     </w:p>
     <w:p>
@@ -72,7 +233,32 @@
         <w:spacing w:before="0" w:after="0"/>
       </w:pPr>
       <w:r>
-        <w:t>Describe the target audience(s) for this project, current and potential users.</w:t>
+        <w:fldChar w:fldCharType="begin">
+          <w:ffData>
+            <w:name w:val="Check1"/>
+            <w:enabled/>
+            <w:calcOnExit w:val="0"/>
+            <w:checkBox>
+              <w:sizeAuto/>
+              <w:default w:val="0"/>
+            </w:checkBox>
+          </w:ffData>
+        </w:fldChar>
+      </w:r>
+      <w:r>
+        <w:instrText xml:space="preserve"> FORMCHECKBOX </w:instrText>
+      </w:r>
+      <w:r>
+        <w:fldChar w:fldCharType="separate"/>
+      </w:r>
+      <w:r>
+        <w:fldChar w:fldCharType="end"/>
+      </w:r>
+      <w:r>
+        <w:t xml:space="preserve"> </w:t>
+      </w:r>
+      <w:r>
+        <w:t>Copyrighted; permission has been or will be obtained</w:t>
       </w:r>
     </w:p>
     <w:p>
@@ -84,10 +270,32 @@
         <w:spacing w:before="0" w:after="0"/>
       </w:pPr>
       <w:r>
-        <w:t>Describe types</w:t>
-      </w:r>
-      <w:r>
-        <w:t xml:space="preserve"> (media) of materials to be digitized and the number of each type (e.g. 12 letters (31 pages total); 14 photographs; 1 audio tape). Include format, condition, and any special handling requirements.</w:t>
+        <w:fldChar w:fldCharType="begin">
+          <w:ffData>
+            <w:name w:val="Check1"/>
+            <w:enabled/>
+            <w:calcOnExit w:val="0"/>
+            <w:checkBox>
+              <w:sizeAuto/>
+              <w:default w:val="0"/>
+            </w:checkBox>
+          </w:ffData>
+        </w:fldChar>
+      </w:r>
+      <w:r>
+        <w:instrText xml:space="preserve"> FORMCHECKBOX </w:instrText>
+      </w:r>
+      <w:r>
+        <w:fldChar w:fldCharType="separate"/>
+      </w:r>
+      <w:r>
+        <w:fldChar w:fldCharType="end"/>
+      </w:r>
+      <w:r>
+        <w:t xml:space="preserve"> </w:t>
+      </w:r>
+      <w:r>
+        <w:t>Copyrighted; use may be justified by fair use</w:t>
       </w:r>
     </w:p>
     <w:p>
@@ -99,10 +307,32 @@
         <w:spacing w:before="0" w:after="0"/>
       </w:pPr>
       <w:r>
-        <w:t>If the items to be digitized are held by an institution (e</w:t>
-      </w:r>
-      <w:r>
-        <w:t>.g., IU Libraries, IU Archives of Traditional Music, Monroe County Historical Society), explain your collaboration and agreement with the institution for conducting this project.</w:t>
+        <w:fldChar w:fldCharType="begin">
+          <w:ffData>
+            <w:name w:val="Check1"/>
+            <w:enabled/>
+            <w:calcOnExit w:val="0"/>
+            <w:checkBox>
+              <w:sizeAuto/>
+              <w:default w:val="0"/>
+            </w:checkBox>
+          </w:ffData>
+        </w:fldChar>
+      </w:r>
+      <w:r>
+        <w:instrText xml:space="preserve"> FORMCHECKBOX </w:instrText>
+      </w:r>
+      <w:r>
+        <w:fldChar w:fldCharType="separate"/>
+      </w:r>
+      <w:r>
+        <w:fldChar w:fldCharType="end"/>
+      </w:r>
+      <w:r>
+        <w:t xml:space="preserve"> </w:t>
+      </w:r>
+      <w:r>
+        <w:t>Copyright status requires further investigation</w:t>
       </w:r>
     </w:p>
     <w:p>
@@ -114,183 +344,51 @@
         <w:spacing w:before="0" w:after="0"/>
       </w:pPr>
       <w:r>
-        <w:t xml:space="preserve">Do you have any existing descriptive information (i.e., metadata) that could </w:t>
-      </w:r>
-      <w:r>
-        <w:t>be used for searching these materials? What descriptive information do you currently have (e.g., title, creator, date)? In what form does this descriptive information exist (on paper, in a Word document, in an Excel file, etc.)</w:t>
-      </w:r>
-    </w:p>
-    <w:p>
-      <w:pPr>
-        <w:numPr>
-          <w:ilvl w:val="0"/>
-          <w:numId w:val="1"/>
-        </w:numPr>
-        <w:spacing w:before="0" w:after="0"/>
-      </w:pPr>
-      <w:r>
-        <w:t>Describe your personal inter</w:t>
-      </w:r>
-      <w:r>
-        <w:t>est in and possible contribution to this project.</w:t>
-      </w:r>
-    </w:p>
-    <w:p>
-      <w:pPr>
-        <w:numPr>
-          <w:ilvl w:val="0"/>
-          <w:numId w:val="1"/>
-        </w:numPr>
-        <w:spacing w:before="0" w:after="0"/>
-      </w:pPr>
-      <w:r>
-        <w:t>Other general comments, issues or concerns.</w:t>
-      </w:r>
-    </w:p>
-    <w:p>
-      <w:pPr>
-        <w:numPr>
-          <w:ilvl w:val="0"/>
-          <w:numId w:val="1"/>
-        </w:numPr>
-        <w:spacing w:before="0" w:after="0"/>
-      </w:pPr>
-      <w:r>
-        <w:t>Indicate copyright status. Please refer to Cornell’s Copyright Information Center (</w:t>
-      </w:r>
-      <w:hyperlink r:id="rId5" w:history="1">
-        <w:r>
-          <w:rPr>
-            <w:color w:val="0000FF" w:themeColor="hyperlink"/>
-            <w:u w:val="single"/>
-          </w:rPr>
-          <w:t>https://copyright.cornell.edu/</w:t>
-        </w:r>
-      </w:hyperlink>
-      <w:r>
-        <w:t xml:space="preserve"> a</w:t>
-      </w:r>
-      <w:r>
-        <w:t xml:space="preserve">nd especially </w:t>
-      </w:r>
-      <w:hyperlink r:id="rId6" w:history="1">
-        <w:r>
-          <w:rPr>
-            <w:color w:val="0000FF" w:themeColor="hyperlink"/>
-            <w:u w:val="single"/>
-          </w:rPr>
-          <w:t>https://copyright.cornell.edu/publicdomain</w:t>
-        </w:r>
-      </w:hyperlink>
-      <w:r>
-        <w:t>) for information to help you determine the copyright status of your materials. Below, please explain your understanding of the copyright sta</w:t>
-      </w:r>
-      <w:r>
-        <w:t>tus of the material.</w:t>
-      </w:r>
-    </w:p>
-    <w:p>
-      <w:pPr>
-        <w:pStyle w:val="ListParagraph"/>
-        <w:spacing w:before="0" w:after="0"/>
-        <w:ind w:left="1440"/>
-      </w:pPr>
-      <w:r>
-        <w:rPr>
-          <w:rFonts w:ascii="Segoe UI Symbol" w:hAnsi="Segoe UI Symbol" w:cs="Segoe UI Symbol"/>
-        </w:rPr>
-        <w:t>☐</w:t>
-      </w:r>
-      <w:r>
-        <w:rPr>
-          <w:rFonts w:ascii="Segoe UI Symbol" w:hAnsi="Segoe UI Symbol" w:cs="Segoe UI Symbol"/>
-        </w:rPr>
+        <w:fldChar w:fldCharType="begin">
+          <w:ffData>
+            <w:name w:val="Check1"/>
+            <w:enabled/>
+            <w:calcOnExit w:val="0"/>
+            <w:checkBox>
+              <w:sizeAuto/>
+              <w:default w:val="0"/>
+            </w:checkBox>
+          </w:ffData>
+        </w:fldChar>
+      </w:r>
+      <w:r>
+        <w:instrText xml:space="preserve"> FORMCHECKBOX </w:instrText>
+      </w:r>
+      <w:r>
+        <w:fldChar w:fldCharType="separate"/>
+      </w:r>
+      <w:r>
+        <w:fldChar w:fldCharType="end"/>
+      </w:r>
+      <w:r>
         <w:t xml:space="preserve"> </w:t>
       </w:r>
       <w:r>
-        <w:t xml:space="preserve">Public </w:t>
-      </w:r>
-      <w:r>
-        <w:t>d</w:t>
-      </w:r>
-      <w:r>
-        <w:t>omain</w:t>
-      </w:r>
-    </w:p>
-    <w:p>
-      <w:pPr>
-        <w:pStyle w:val="ListParagraph"/>
-        <w:ind w:left="1440"/>
-      </w:pPr>
-      <w:r>
-        <w:rPr>
-          <w:rFonts w:ascii="Segoe UI Symbol" w:hAnsi="Segoe UI Symbol" w:cs="Segoe UI Symbol"/>
-        </w:rPr>
-        <w:t>☐</w:t>
-      </w:r>
-      <w:r>
-        <w:rPr>
-          <w:rFonts w:ascii="Segoe UI Symbol" w:hAnsi="Segoe UI Symbol" w:cs="Segoe UI Symbol"/>
-        </w:rPr>
-        <w:t xml:space="preserve"> </w:t>
-      </w:r>
-      <w:r>
-        <w:t>Owned and controlled by you</w:t>
-      </w:r>
-    </w:p>
-    <w:p>
-      <w:pPr>
-        <w:pStyle w:val="ListParagraph"/>
-        <w:spacing w:before="0" w:after="0"/>
-        <w:ind w:left="1440"/>
-      </w:pPr>
-      <w:r>
-        <w:rPr>
-          <w:rFonts w:ascii="Segoe UI Symbol" w:hAnsi="Segoe UI Symbol" w:cs="Segoe UI Symbol"/>
-        </w:rPr>
-        <w:t>☐</w:t>
-      </w:r>
-      <w:r>
-        <w:rPr>
-          <w:rFonts w:ascii="Segoe UI Symbol" w:hAnsi="Segoe UI Symbol" w:cs="Segoe UI Symbol"/>
-        </w:rPr>
-        <w:t xml:space="preserve"> </w:t>
-      </w:r>
-      <w:r>
-        <w:t>Owned by someone else, but permission secured</w:t>
-      </w:r>
-    </w:p>
-    <w:p>
-      <w:pPr>
-        <w:pStyle w:val="ListParagraph"/>
-        <w:spacing w:before="0" w:after="0"/>
-        <w:ind w:left="1440"/>
-      </w:pPr>
-      <w:r>
-        <w:rPr>
-          <w:rFonts w:ascii="Segoe UI Symbol" w:hAnsi="Segoe UI Symbol" w:cs="Segoe UI Symbol"/>
-        </w:rPr>
-        <w:t>☐</w:t>
-      </w:r>
-      <w:r>
-        <w:rPr>
-          <w:rFonts w:ascii="Segoe UI Symbol" w:hAnsi="Segoe UI Symbol" w:cs="Segoe UI Symbol"/>
-        </w:rPr>
-        <w:t xml:space="preserve"> </w:t>
-      </w:r>
-      <w:r>
-        <w:t>Situation unknown or unclear</w:t>
-      </w:r>
-    </w:p>
-    <w:p>
-      <w:pPr>
-        <w:ind w:left="1440"/>
-      </w:pPr>
-      <w:r>
-        <w:t>C</w:t>
-      </w:r>
-      <w:r>
-        <w:t>opyright explanation:</w:t>
+        <w:t>Other / mixed</w:t>
+      </w:r>
+    </w:p>
+    <w:p>
+      <w:r>
+        <w:t>Briefly explain your assessment. Identify any uncertainties and, if necessary, what additional investigation you need to undertake.</w:t>
+      </w:r>
+    </w:p>
+    <w:p>
+      <w:pPr>
+        <w:pStyle w:val="Heading3"/>
+        <w:keepNext/>
+      </w:pPr>
+      <w:r>
+        <w:t>7. Questions, Concerns, or Other Information (Optional)</w:t>
+      </w:r>
+    </w:p>
+    <w:p>
+      <w:r>
+        <w:t>Identify anything about the proposed project that you are currently uncertain about or would particularly like feedback on. You may also include any other information that would help us understand your proposed project.</w:t>
       </w:r>
     </w:p>
     <w:sectPr>
@@ -304,205 +402,107 @@
 </file>
 
 <file path=word/numbering.xml><?xml version="1.0" encoding="utf-8"?>
-<w:numbering xmlns:wpc="http://schemas.microsoft.com/office/word/2010/wordprocessingCanvas" xmlns:cx="http://schemas.microsoft.com/office/drawing/2014/chartex" xmlns:cx1="http://schemas.microsoft.com/office/drawing/2015/9/8/chartex" xmlns:cx2="http://schemas.microsoft.com/office/drawing/2015/10/21/chartex" xmlns:cx3="http://schemas.microsoft.com/office/drawing/2016/5/9/chartex" xmlns:cx4="http://schemas.microsoft.com/office/drawing/2016/5/10/chartex" xmlns:cx5="http://schemas.microsoft.com/office/drawing/2016/5/11/chartex" xmlns:cx6="http://schemas.microsoft.com/office/drawing/2016/5/12/chartex" xmlns:cx7="http://schemas.microsoft.com/office/drawing/2016/5/13/chartex" xmlns:cx8="http://schemas.microsoft.com/office/drawing/2016/5/14/chartex" xmlns:mc="http://schemas.openxmlformats.org/markup-compatibility/2006" xmlns:aink="http://schemas.microsoft.com/office/drawing/2016/ink" xmlns:am3d="http://schemas.microsoft.com/office/drawing/2017/model3d" xmlns:o="urn:schemas-microsoft-com:office:office" xmlns:oel="http://schemas.microsoft.com/office/2019/extlst" xmlns:r="http://schemas.openxmlformats.org/officeDocument/2006/relationships" xmlns:m="http://schemas.openxmlformats.org/officeDocument/2006/math" xmlns:v="urn:schemas-microsoft-com:vml" xmlns:wp14="http://schemas.microsoft.com/office/word/2010/wordprocessingDrawing" xmlns:wp="http://schemas.openxmlformats.org/drawingml/2006/wordprocessingDrawing" xmlns:w10="urn:schemas-microsoft-com:office:word" xmlns:w="http://schemas.openxmlformats.org/wordprocessingml/2006/main" xmlns:w14="http://schemas.microsoft.com/office/word/2010/wordml" xmlns:w15="http://schemas.microsoft.com/office/word/2012/wordml" xmlns:w16cex="http://schemas.microsoft.com/office/word/2018/wordml/cex" xmlns:w16cid="http://schemas.microsoft.com/office/word/2016/wordml/cid" xmlns:w16="http://schemas.microsoft.com/office/word/2018/wordml" xmlns:w16sdtdh="http://schemas.microsoft.com/office/word/2020/wordml/sdtdatahash" xmlns:w16se="http://schemas.microsoft.com/office/word/2015/wordml/symex" xmlns:wpg="http://schemas.microsoft.com/office/word/2010/wordprocessingGroup" xmlns:wpi="http://schemas.microsoft.com/office/word/2010/wordprocessingInk" xmlns:wne="http://schemas.microsoft.com/office/word/2006/wordml" xmlns:wps="http://schemas.microsoft.com/office/word/2010/wordprocessingShape" mc:Ignorable="w14 w15 w16se w16cid w16 w16cex w16sdtdh wp14">
+<w:numbering xmlns:wpc="http://schemas.microsoft.com/office/word/2010/wordprocessingCanvas" xmlns:cx="http://schemas.microsoft.com/office/drawing/2014/chartex" xmlns:cx1="http://schemas.microsoft.com/office/drawing/2015/9/8/chartex" xmlns:cx2="http://schemas.microsoft.com/office/drawing/2015/10/21/chartex" xmlns:cx3="http://schemas.microsoft.com/office/drawing/2016/5/9/chartex" xmlns:cx4="http://schemas.microsoft.com/office/drawing/2016/5/10/chartex" xmlns:cx5="http://schemas.microsoft.com/office/drawing/2016/5/11/chartex" xmlns:cx6="http://schemas.microsoft.com/office/drawing/2016/5/12/chartex" xmlns:cx7="http://schemas.microsoft.com/office/drawing/2016/5/13/chartex" xmlns:cx8="http://schemas.microsoft.com/office/drawing/2016/5/14/chartex" xmlns:mc="http://schemas.openxmlformats.org/markup-compatibility/2006" xmlns:m="http://schemas.openxmlformats.org/officeDocument/2006/math" xmlns:aink="http://schemas.microsoft.com/office/drawing/2016/ink" xmlns:am3d="http://schemas.microsoft.com/office/drawing/2017/model3d" xmlns:oel="http://schemas.microsoft.com/office/2019/extlst" xmlns:r="http://schemas.openxmlformats.org/officeDocument/2006/relationships" xmlns:wp14="http://schemas.microsoft.com/office/word/2010/wordprocessingDrawing" xmlns:wp="http://schemas.openxmlformats.org/drawingml/2006/wordprocessingDrawing" xmlns:wpg="http://schemas.microsoft.com/office/word/2010/wordprocessingGroup" xmlns:wpi="http://schemas.microsoft.com/office/word/2010/wordprocessingInk" xmlns:wps="http://schemas.microsoft.com/office/word/2010/wordprocessingShape" xmlns:o="urn:schemas-microsoft-com:office:office" xmlns:v="urn:schemas-microsoft-com:vml" xmlns:w10="urn:schemas-microsoft-com:office:word" xmlns:w="http://schemas.openxmlformats.org/wordprocessingml/2006/main" xmlns:w14="http://schemas.microsoft.com/office/word/2010/wordml" xmlns:w15="http://schemas.microsoft.com/office/word/2012/wordml" xmlns:w16cex="http://schemas.microsoft.com/office/word/2018/wordml/cex" xmlns:w16cid="http://schemas.microsoft.com/office/word/2016/wordml/cid" xmlns:w16="http://schemas.microsoft.com/office/word/2018/wordml" xmlns:w16sdtdh="http://schemas.microsoft.com/office/word/2020/wordml/sdtdatahash" xmlns:w16sdtfl="http://schemas.microsoft.com/office/word/2024/wordml/sdtformatlock" xmlns:w16se="http://schemas.microsoft.com/office/word/2015/wordml/symex" xmlns:w16du="http://schemas.microsoft.com/office/word/2023/wordml/word16du" xmlns:wne="http://schemas.microsoft.com/office/word/2006/wordml" mc:Ignorable="w14 w15 w16se w16cid w16 w16cex w16sdtdh w16sdtfl w16du wp14">
   <w:abstractNum w:abstractNumId="0" w15:restartNumberingAfterBreak="0">
     <w:nsid w:val="099A08C1"/>
     <w:multiLevelType w:val="hybridMultilevel"/>
-    <w:tmpl w:val="FFFFFFFF"/>
-    <w:lvl w:ilvl="0" w:tplc="5CE098CA">
+    <w:tmpl w:val="16BEF6DC"/>
+    <w:lvl w:ilvl="0" w:tplc="FB4298FE">
       <w:start w:val="1"/>
-      <w:numFmt w:val="decimal"/>
-      <w:lvlText w:val="%1."/>
+      <w:numFmt w:val="bullet"/>
+      <w:lvlText w:val=""/>
       <w:lvlJc w:val="left"/>
       <w:pPr>
         <w:ind w:left="720" w:hanging="360"/>
       </w:pPr>
+      <w:rPr>
+        <w:rFonts w:ascii="Symbol" w:hAnsi="Symbol" w:hint="default"/>
+      </w:rPr>
     </w:lvl>
-    <w:lvl w:ilvl="1" w:tplc="1C809D80">
+    <w:lvl w:ilvl="1" w:tplc="D24E7E9A">
       <w:start w:val="1"/>
-      <w:numFmt w:val="decimal"/>
-      <w:lvlText w:val="%2."/>
+      <w:numFmt w:val="bullet"/>
+      <w:lvlText w:val=""/>
       <w:lvlJc w:val="left"/>
       <w:pPr>
         <w:ind w:left="1440" w:hanging="360"/>
       </w:pPr>
+      <w:rPr>
+        <w:rFonts w:ascii="Symbol" w:hAnsi="Symbol" w:hint="default"/>
+      </w:rPr>
     </w:lvl>
-    <w:lvl w:ilvl="2" w:tplc="CD000CF6">
+    <w:lvl w:ilvl="2" w:tplc="821AA916">
       <w:start w:val="1"/>
-      <w:numFmt w:val="decimal"/>
-      <w:lvlText w:val="%3."/>
+      <w:numFmt w:val="bullet"/>
+      <w:lvlText w:val=""/>
       <w:lvlJc w:val="left"/>
       <w:pPr>
         <w:ind w:left="2160" w:hanging="360"/>
       </w:pPr>
+      <w:rPr>
+        <w:rFonts w:ascii="Symbol" w:hAnsi="Symbol" w:hint="default"/>
+      </w:rPr>
     </w:lvl>
-    <w:lvl w:ilvl="3" w:tplc="B268CC20">
+    <w:lvl w:ilvl="3" w:tplc="1B1A2414">
       <w:start w:val="1"/>
-      <w:numFmt w:val="decimal"/>
-      <w:lvlText w:val="%4."/>
+      <w:numFmt w:val="bullet"/>
+      <w:lvlText w:val=""/>
       <w:lvlJc w:val="left"/>
       <w:pPr>
         <w:ind w:left="2880" w:hanging="360"/>
       </w:pPr>
+      <w:rPr>
+        <w:rFonts w:ascii="Symbol" w:hAnsi="Symbol" w:hint="default"/>
+      </w:rPr>
     </w:lvl>
-    <w:lvl w:ilvl="4" w:tplc="981291AA">
+    <w:lvl w:ilvl="4" w:tplc="8BF0F9D2">
       <w:start w:val="1"/>
-      <w:numFmt w:val="decimal"/>
-      <w:lvlText w:val="%5."/>
+      <w:numFmt w:val="bullet"/>
+      <w:lvlText w:val=""/>
       <w:lvlJc w:val="left"/>
       <w:pPr>
         <w:ind w:left="3600" w:hanging="360"/>
       </w:pPr>
+      <w:rPr>
+        <w:rFonts w:ascii="Symbol" w:hAnsi="Symbol" w:hint="default"/>
+      </w:rPr>
     </w:lvl>
-    <w:lvl w:ilvl="5" w:tplc="A850B350">
+    <w:lvl w:ilvl="5" w:tplc="B61CF26C">
       <w:start w:val="1"/>
-      <w:numFmt w:val="decimal"/>
-      <w:lvlText w:val="%6."/>
+      <w:numFmt w:val="bullet"/>
+      <w:lvlText w:val=""/>
       <w:lvlJc w:val="left"/>
       <w:pPr>
         <w:ind w:left="4320" w:hanging="360"/>
       </w:pPr>
+      <w:rPr>
+        <w:rFonts w:ascii="Symbol" w:hAnsi="Symbol" w:hint="default"/>
+      </w:rPr>
     </w:lvl>
-    <w:lvl w:ilvl="6" w:tplc="86AAB8C2">
+    <w:lvl w:ilvl="6" w:tplc="9B2459C0">
       <w:numFmt w:val="decimal"/>
       <w:lvlText w:val=""/>
       <w:lvlJc w:val="left"/>
     </w:lvl>
-    <w:lvl w:ilvl="7" w:tplc="76A4E898">
+    <w:lvl w:ilvl="7" w:tplc="958A6EFC">
       <w:numFmt w:val="decimal"/>
       <w:lvlText w:val=""/>
       <w:lvlJc w:val="left"/>
     </w:lvl>
-    <w:lvl w:ilvl="8" w:tplc="D25464EA">
+    <w:lvl w:ilvl="8" w:tplc="487E696C">
       <w:numFmt w:val="decimal"/>
       <w:lvlText w:val=""/>
       <w:lvlJc w:val="left"/>
     </w:lvl>
   </w:abstractNum>
-  <w:abstractNum w:abstractNumId="1" w15:restartNumberingAfterBreak="0">
-    <w:nsid w:val="5A1A6196"/>
-    <w:multiLevelType w:val="hybridMultilevel"/>
-    <w:tmpl w:val="164CCCD6"/>
-    <w:lvl w:ilvl="0" w:tplc="04090003">
-      <w:start w:val="1"/>
-      <w:numFmt w:val="bullet"/>
-      <w:lvlText w:val="o"/>
-      <w:lvlJc w:val="left"/>
-      <w:pPr>
-        <w:ind w:left="1440" w:hanging="360"/>
-      </w:pPr>
-      <w:rPr>
-        <w:rFonts w:ascii="Courier New" w:hAnsi="Courier New" w:cs="Courier New" w:hint="default"/>
-      </w:rPr>
-    </w:lvl>
-    <w:lvl w:ilvl="1" w:tplc="04090003" w:tentative="1">
-      <w:start w:val="1"/>
-      <w:numFmt w:val="bullet"/>
-      <w:lvlText w:val="o"/>
-      <w:lvlJc w:val="left"/>
-      <w:pPr>
-        <w:ind w:left="2160" w:hanging="360"/>
-      </w:pPr>
-      <w:rPr>
-        <w:rFonts w:ascii="Courier New" w:hAnsi="Courier New" w:cs="Courier New" w:hint="default"/>
-      </w:rPr>
-    </w:lvl>
-    <w:lvl w:ilvl="2" w:tplc="04090005" w:tentative="1">
-      <w:start w:val="1"/>
-      <w:numFmt w:val="bullet"/>
-      <w:lvlText w:val=""/>
-      <w:lvlJc w:val="left"/>
-      <w:pPr>
-        <w:ind w:left="2880" w:hanging="360"/>
-      </w:pPr>
-      <w:rPr>
-        <w:rFonts w:ascii="Wingdings" w:hAnsi="Wingdings" w:hint="default"/>
-      </w:rPr>
-    </w:lvl>
-    <w:lvl w:ilvl="3" w:tplc="04090001" w:tentative="1">
-      <w:start w:val="1"/>
-      <w:numFmt w:val="bullet"/>
-      <w:lvlText w:val=""/>
-      <w:lvlJc w:val="left"/>
-      <w:pPr>
-        <w:ind w:left="3600" w:hanging="360"/>
-      </w:pPr>
-      <w:rPr>
-        <w:rFonts w:ascii="Symbol" w:hAnsi="Symbol" w:hint="default"/>
-      </w:rPr>
-    </w:lvl>
-    <w:lvl w:ilvl="4" w:tplc="04090003" w:tentative="1">
-      <w:start w:val="1"/>
-      <w:numFmt w:val="bullet"/>
-      <w:lvlText w:val="o"/>
-      <w:lvlJc w:val="left"/>
-      <w:pPr>
-        <w:ind w:left="4320" w:hanging="360"/>
-      </w:pPr>
-      <w:rPr>
-        <w:rFonts w:ascii="Courier New" w:hAnsi="Courier New" w:cs="Courier New" w:hint="default"/>
-      </w:rPr>
-    </w:lvl>
-    <w:lvl w:ilvl="5" w:tplc="04090005" w:tentative="1">
-      <w:start w:val="1"/>
-      <w:numFmt w:val="bullet"/>
-      <w:lvlText w:val=""/>
-      <w:lvlJc w:val="left"/>
-      <w:pPr>
-        <w:ind w:left="5040" w:hanging="360"/>
-      </w:pPr>
-      <w:rPr>
-        <w:rFonts w:ascii="Wingdings" w:hAnsi="Wingdings" w:hint="default"/>
-      </w:rPr>
-    </w:lvl>
-    <w:lvl w:ilvl="6" w:tplc="04090001" w:tentative="1">
-      <w:start w:val="1"/>
-      <w:numFmt w:val="bullet"/>
-      <w:lvlText w:val=""/>
-      <w:lvlJc w:val="left"/>
-      <w:pPr>
-        <w:ind w:left="5760" w:hanging="360"/>
-      </w:pPr>
-      <w:rPr>
-        <w:rFonts w:ascii="Symbol" w:hAnsi="Symbol" w:hint="default"/>
-      </w:rPr>
-    </w:lvl>
-    <w:lvl w:ilvl="7" w:tplc="04090003" w:tentative="1">
-      <w:start w:val="1"/>
-      <w:numFmt w:val="bullet"/>
-      <w:lvlText w:val="o"/>
-      <w:lvlJc w:val="left"/>
-      <w:pPr>
-        <w:ind w:left="6480" w:hanging="360"/>
-      </w:pPr>
-      <w:rPr>
-        <w:rFonts w:ascii="Courier New" w:hAnsi="Courier New" w:cs="Courier New" w:hint="default"/>
-      </w:rPr>
-    </w:lvl>
-    <w:lvl w:ilvl="8" w:tplc="04090005" w:tentative="1">
-      <w:start w:val="1"/>
-      <w:numFmt w:val="bullet"/>
-      <w:lvlText w:val=""/>
-      <w:lvlJc w:val="left"/>
-      <w:pPr>
-        <w:ind w:left="7200" w:hanging="360"/>
-      </w:pPr>
-      <w:rPr>
-        <w:rFonts w:ascii="Wingdings" w:hAnsi="Wingdings" w:hint="default"/>
-      </w:rPr>
-    </w:lvl>
-  </w:abstractNum>
-  <w:num w:numId="1" w16cid:durableId="326901739">
+  <w:num w:numId="1" w16cid:durableId="377050710">
     <w:abstractNumId w:val="0"/>
-  </w:num>
-  <w:num w:numId="2" w16cid:durableId="480930595">
-    <w:abstractNumId w:val="1"/>
   </w:num>
 </w:numbering>
 </file>
 
 <file path=word/styles.xml><?xml version="1.0" encoding="utf-8"?>
-<w:styles xmlns:mc="http://schemas.openxmlformats.org/markup-compatibility/2006" xmlns:r="http://schemas.openxmlformats.org/officeDocument/2006/relationships" xmlns:w="http://schemas.openxmlformats.org/wordprocessingml/2006/main" xmlns:w14="http://schemas.microsoft.com/office/word/2010/wordml" xmlns:w15="http://schemas.microsoft.com/office/word/2012/wordml" xmlns:w16cex="http://schemas.microsoft.com/office/word/2018/wordml/cex" xmlns:w16cid="http://schemas.microsoft.com/office/word/2016/wordml/cid" xmlns:w16="http://schemas.microsoft.com/office/word/2018/wordml" xmlns:w16sdtdh="http://schemas.microsoft.com/office/word/2020/wordml/sdtdatahash" xmlns:w16se="http://schemas.microsoft.com/office/word/2015/wordml/symex" mc:Ignorable="w14 w15 w16se w16cid w16 w16cex w16sdtdh">
+<w:styles xmlns:mc="http://schemas.openxmlformats.org/markup-compatibility/2006" xmlns:r="http://schemas.openxmlformats.org/officeDocument/2006/relationships" xmlns:w="http://schemas.openxmlformats.org/wordprocessingml/2006/main" xmlns:w14="http://schemas.microsoft.com/office/word/2010/wordml" xmlns:w15="http://schemas.microsoft.com/office/word/2012/wordml" xmlns:w16cex="http://schemas.microsoft.com/office/word/2018/wordml/cex" xmlns:w16cid="http://schemas.microsoft.com/office/word/2016/wordml/cid" xmlns:w16="http://schemas.microsoft.com/office/word/2018/wordml" xmlns:w16sdtdh="http://schemas.microsoft.com/office/word/2020/wordml/sdtdatahash" xmlns:w16sdtfl="http://schemas.microsoft.com/office/word/2024/wordml/sdtformatlock" xmlns:w16se="http://schemas.microsoft.com/office/word/2015/wordml/symex" xmlns:w16du="http://schemas.microsoft.com/office/word/2023/wordml/word16du" mc:Ignorable="w14 w15 w16se w16cid w16 w16cex w16sdtdh w16sdtfl w16du">
   <w:docDefaults>
     <w:rPrDefault>
       <w:rPr>
@@ -575,6 +575,7 @@
     <w:lsdException w:name="List Number 3" w:semiHidden="1" w:unhideWhenUsed="1"/>
     <w:lsdException w:name="List Number 4" w:semiHidden="1" w:unhideWhenUsed="1"/>
     <w:lsdException w:name="List Number 5" w:semiHidden="1" w:unhideWhenUsed="1"/>
+    <w:lsdException w:name="Title" w:semiHidden="1" w:unhideWhenUsed="1"/>
     <w:lsdException w:name="Closing" w:semiHidden="1" w:unhideWhenUsed="1"/>
     <w:lsdException w:name="Signature" w:semiHidden="1" w:unhideWhenUsed="1"/>
     <w:lsdException w:name="Default Paragraph Font" w:semiHidden="1" w:uiPriority="1" w:unhideWhenUsed="1"/>
@@ -586,6 +587,7 @@
     <w:lsdException w:name="List Continue 4" w:semiHidden="1" w:unhideWhenUsed="1"/>
     <w:lsdException w:name="List Continue 5" w:semiHidden="1" w:unhideWhenUsed="1"/>
     <w:lsdException w:name="Message Header" w:semiHidden="1" w:unhideWhenUsed="1"/>
+    <w:lsdException w:name="Subtitle" w:semiHidden="1" w:unhideWhenUsed="1"/>
     <w:lsdException w:name="Salutation" w:semiHidden="1" w:unhideWhenUsed="1"/>
     <w:lsdException w:name="Date" w:semiHidden="1" w:unhideWhenUsed="1"/>
     <w:lsdException w:name="Body Text First Indent" w:semiHidden="1" w:unhideWhenUsed="1"/>
@@ -666,7 +668,8 @@
     <w:lsdException w:name="Table Web 3" w:semiHidden="1" w:unhideWhenUsed="1"/>
     <w:lsdException w:name="Balloon Text" w:semiHidden="1" w:unhideWhenUsed="1"/>
     <w:lsdException w:name="Table Theme" w:semiHidden="1" w:unhideWhenUsed="1"/>
-    <w:lsdException w:name="Placeholder Text" w:semiHidden="1"/>
+    <w:lsdException w:name="Placeholder Text" w:semiHidden="1" w:unhideWhenUsed="1"/>
+    <w:lsdException w:name="No Spacing" w:semiHidden="1" w:unhideWhenUsed="1"/>
     <w:lsdException w:name="Light Shading"/>
     <w:lsdException w:name="Light List"/>
     <w:lsdException w:name="Light Grid"/>
@@ -687,9 +690,10 @@
     <w:lsdException w:name="Medium Shading 1 Accent 1"/>
     <w:lsdException w:name="Medium Shading 2 Accent 1"/>
     <w:lsdException w:name="Medium List 1 Accent 1"/>
-    <w:lsdException w:name="Revision" w:semiHidden="1"/>
+    <w:lsdException w:name="Revision" w:semiHidden="1" w:unhideWhenUsed="1"/>
     <w:lsdException w:name="List Paragraph" w:uiPriority="34" w:qFormat="1"/>
     <w:lsdException w:name="Quote" w:uiPriority="29" w:qFormat="1"/>
+    <w:lsdException w:name="Intense Quote" w:semiHidden="1" w:unhideWhenUsed="1"/>
     <w:lsdException w:name="Medium List 2 Accent 1"/>
     <w:lsdException w:name="Medium Grid 1 Accent 1"/>
     <w:lsdException w:name="Medium Grid 2 Accent 1"/>
@@ -768,13 +772,13 @@
     <w:lsdException w:name="Colorful Shading Accent 6"/>
     <w:lsdException w:name="Colorful List Accent 6"/>
     <w:lsdException w:name="Colorful Grid Accent 6"/>
+    <w:lsdException w:name="Subtle Emphasis" w:semiHidden="1" w:unhideWhenUsed="1"/>
+    <w:lsdException w:name="Intense Emphasis" w:semiHidden="1" w:unhideWhenUsed="1"/>
+    <w:lsdException w:name="Subtle Reference" w:semiHidden="1" w:unhideWhenUsed="1"/>
+    <w:lsdException w:name="Intense Reference" w:semiHidden="1" w:unhideWhenUsed="1"/>
+    <w:lsdException w:name="Book Title" w:semiHidden="1" w:unhideWhenUsed="1"/>
     <w:lsdException w:name="Bibliography" w:semiHidden="1" w:unhideWhenUsed="1"/>
     <w:lsdException w:name="TOC Heading" w:semiHidden="1" w:unhideWhenUsed="1"/>
-    <w:lsdException w:name="Plain Table 5" w:semiHidden="1" w:unhideWhenUsed="1"/>
-    <w:lsdException w:name="Grid Table Light" w:semiHidden="1" w:unhideWhenUsed="1"/>
-    <w:lsdException w:name="Grid Table 1 Light" w:semiHidden="1" w:unhideWhenUsed="1"/>
-    <w:lsdException w:name="Grid Table 2" w:semiHidden="1" w:unhideWhenUsed="1"/>
-    <w:lsdException w:name="Grid Table 3" w:semiHidden="1" w:unhideWhenUsed="1"/>
     <w:lsdException w:name="Grid Table 4" w:uiPriority="49"/>
     <w:lsdException w:name="Grid Table 5 Dark" w:uiPriority="50"/>
     <w:lsdException w:name="Grid Table 6 Colorful" w:uiPriority="51"/>
@@ -1172,17 +1176,6 @@
     <w:rPr>
       <w:i/>
     </w:rPr>
-  </w:style>
-  <w:style w:type="paragraph" w:styleId="ListParagraph">
-    <w:name w:val="List Paragraph"/>
-    <w:basedOn w:val="Normal"/>
-    <w:uiPriority w:val="34"/>
-    <w:qFormat/>
-    <w:rsid w:val="00EB1BA2"/>
-    <w:pPr>
-      <w:ind w:left="720"/>
-      <w:contextualSpacing/>
-    </w:pPr>
   </w:style>
 </w:styles>
 </file>

</xml_diff>